<commit_message>
Fix workflow push conflicts + add Alpaca sync to monitor/reporter
</commit_message>
<xml_diff>
--- a/data/earnings_calls_log.docx
+++ b/data/earnings_calls_log.docx
@@ -20,7 +20,7 @@
           <w:i/>
           <w:sz w:val="20"/>
         </w:rPr>
-        <w:t>Generated 2026-04-22 17:27 ET  |  5 calls logged</w:t>
+        <w:t>Generated 2026-04-29 23:55 ET  |  19 calls logged</w:t>
       </w:r>
     </w:p>
     <w:p>
@@ -102,7 +102,7 @@
           </w:tcPr>
           <w:p>
             <w:r>
-              <w:t>1</w:t>
+              <w:t>8</w:t>
             </w:r>
           </w:p>
         </w:tc>
@@ -112,7 +112,7 @@
           </w:tcPr>
           <w:p>
             <w:r>
-              <w:t>1</w:t>
+              <w:t>2</w:t>
             </w:r>
           </w:p>
         </w:tc>
@@ -122,7 +122,7 @@
           </w:tcPr>
           <w:p>
             <w:r>
-              <w:t>100%</w:t>
+              <w:t>25%</w:t>
             </w:r>
           </w:p>
         </w:tc>
@@ -144,7 +144,7 @@
           </w:tcPr>
           <w:p>
             <w:r>
-              <w:t>3</w:t>
+              <w:t>8</w:t>
             </w:r>
           </w:p>
         </w:tc>
@@ -154,7 +154,7 @@
           </w:tcPr>
           <w:p>
             <w:r>
-              <w:t>0</w:t>
+              <w:t>2</w:t>
             </w:r>
           </w:p>
         </w:tc>
@@ -164,7 +164,7 @@
           </w:tcPr>
           <w:p>
             <w:r>
-              <w:t>0%</w:t>
+              <w:t>25%</w:t>
             </w:r>
           </w:p>
         </w:tc>
@@ -186,7 +186,7 @@
           </w:tcPr>
           <w:p>
             <w:r>
-              <w:t>1</w:t>
+              <w:t>3</w:t>
             </w:r>
           </w:p>
         </w:tc>
@@ -196,7 +196,7 @@
           </w:tcPr>
           <w:p>
             <w:r>
-              <w:t>1</w:t>
+              <w:t>2</w:t>
             </w:r>
           </w:p>
         </w:tc>
@@ -206,7 +206,7 @@
           </w:tcPr>
           <w:p>
             <w:r>
-              <w:t>100%</w:t>
+              <w:t>67%</w:t>
             </w:r>
           </w:p>
         </w:tc>
@@ -226,9 +226,9 @@
       </w:pPr>
       <w:r>
         <w:rPr>
-          <w:color w:val="2E7D32"/>
+          <w:color w:val="C62828"/>
         </w:rPr>
-        <w:t>ISRG — Intuitive Surgical, Inc.  (WIN)</w:t>
+        <w:t>BKNG — Booking Holdings Inc.  (LOSS)</w:t>
       </w:r>
     </w:p>
     <w:p>
@@ -239,7 +239,7 @@
         <w:t xml:space="preserve">Earnings date: </w:t>
       </w:r>
       <w:r>
-        <w:t xml:space="preserve">2026-04-21   </w:t>
+        <w:t xml:space="preserve">2026-04-28   </w:t>
       </w:r>
       <w:r>
         <w:rPr>
@@ -248,7 +248,7 @@
         <w:t xml:space="preserve">Exit: </w:t>
       </w:r>
       <w:r>
-        <w:t xml:space="preserve">2026-04-22   </w:t>
+        <w:t xml:space="preserve">2026-04-29   </w:t>
       </w:r>
       <w:r>
         <w:rPr>
@@ -268,7 +268,7 @@
         <w:t xml:space="preserve">Entry: </w:t>
       </w:r>
       <w:r>
-        <w:t xml:space="preserve">$470.28   </w:t>
+        <w:t xml:space="preserve">$192.46   </w:t>
       </w:r>
       <w:r>
         <w:rPr>
@@ -277,7 +277,7 @@
         <w:t xml:space="preserve">Exit: </w:t>
       </w:r>
       <w:r>
-        <w:t xml:space="preserve">$488.21   </w:t>
+        <w:t xml:space="preserve">$173.08   </w:t>
       </w:r>
       <w:r>
         <w:rPr>
@@ -286,7 +286,7 @@
         <w:t xml:space="preserve">P&amp;L: </w:t>
       </w:r>
       <w:r>
-        <w:t>$+53.80 (+3.8%)</w:t>
+        <w:t>$-135.66 (-10.1%)</w:t>
       </w:r>
     </w:p>
     <w:p>
@@ -297,7 +297,7 @@
         <w:t xml:space="preserve">EPS: </w:t>
       </w:r>
       <w:r>
-        <w:t>$2.28 reported vs $1.93 est (+18.1%) — BEAT</w:t>
+        <w:t>$1.14 reported vs $1.08 est (+5.6%) — BEAT</w:t>
       </w:r>
     </w:p>
     <w:p>
@@ -308,7 +308,7 @@
         <w:t xml:space="preserve">Call quality: </w:t>
       </w:r>
       <w:r>
-        <w:t>Algorithm aced the call ✓</w:t>
+        <w:t>Algorithm missed the call ✗</w:t>
       </w:r>
     </w:p>
     <w:p>
@@ -319,7 +319,7 @@
         <w:t xml:space="preserve">Analysis: </w:t>
       </w:r>
       <w:r>
-        <w:t>ISRG beat EPS estimates by +18.1% (reported $2.28 vs $1.93 expected). The position returned +3.8% (WIN) against a 100% confidence call (95-100% tier). The model was well-calibrated — it correctly identified the earnings beat and the market confirmed it.</w:t>
+        <w:t>BKNG beat EPS estimates by +5.6% (reported $1.14 vs $1.08 expected). The position returned -10.1% (LOSS) against a 100% confidence call (95-100% tier). The model correctly identified the earnings beat but the market reacted negatively — possible guidance concerns or valuation resistance not captured in the scoring model.</w:t>
       </w:r>
     </w:p>
     <w:p>
@@ -336,9 +336,9 @@
       </w:pPr>
       <w:r>
         <w:rPr>
-          <w:color w:val="2E7D32"/>
+          <w:color w:val="C62828"/>
         </w:rPr>
-        <w:t>PM — Philip Morris International Inc.  (WIN)</w:t>
+        <w:t>HOOD — Robinhood Markets, Inc.  (LOSS)</w:t>
       </w:r>
     </w:p>
     <w:p>
@@ -349,7 +349,7 @@
         <w:t xml:space="preserve">Earnings date: </w:t>
       </w:r>
       <w:r>
-        <w:t xml:space="preserve">2026-04-22   </w:t>
+        <w:t xml:space="preserve">2026-04-28   </w:t>
       </w:r>
       <w:r>
         <w:rPr>
@@ -358,7 +358,7 @@
         <w:t xml:space="preserve">Exit: </w:t>
       </w:r>
       <w:r>
-        <w:t xml:space="preserve">2026-04-22   </w:t>
+        <w:t xml:space="preserve">2026-04-29   </w:t>
       </w:r>
       <w:r>
         <w:rPr>
@@ -367,7 +367,7 @@
         <w:t xml:space="preserve">Confidence: </w:t>
       </w:r>
       <w:r>
-        <w:t>85% (85-94%)</w:t>
+        <w:t>100% (95-100%)</w:t>
       </w:r>
     </w:p>
     <w:p>
@@ -378,7 +378,7 @@
         <w:t xml:space="preserve">Entry: </w:t>
       </w:r>
       <w:r>
-        <w:t xml:space="preserve">$159.50   </w:t>
+        <w:t xml:space="preserve">$89.87   </w:t>
       </w:r>
       <w:r>
         <w:rPr>
@@ -387,7 +387,7 @@
         <w:t xml:space="preserve">Exit: </w:t>
       </w:r>
       <w:r>
-        <w:t xml:space="preserve">$162.52   </w:t>
+        <w:t xml:space="preserve">$70.64   </w:t>
       </w:r>
       <w:r>
         <w:rPr>
@@ -396,7 +396,7 @@
         <w:t xml:space="preserve">P&amp;L: </w:t>
       </w:r>
       <w:r>
-        <w:t>$+9.05 (+1.9%)</w:t>
+        <w:t>$-307.79 (-21.4%)</w:t>
       </w:r>
     </w:p>
     <w:p>
@@ -407,7 +407,7 @@
         <w:t xml:space="preserve">EPS: </w:t>
       </w:r>
       <w:r>
-        <w:t>not available</w:t>
+        <w:t>$0.47 reported vs $0.43 est (+9.3%) — BEAT</w:t>
       </w:r>
     </w:p>
     <w:p>
@@ -418,7 +418,7 @@
         <w:t xml:space="preserve">Call quality: </w:t>
       </w:r>
       <w:r>
-        <w:t>Unverified</w:t>
+        <w:t>Algorithm missed the call ✗</w:t>
       </w:r>
     </w:p>
     <w:p>
@@ -429,7 +429,1547 @@
         <w:t xml:space="preserve">Analysis: </w:t>
       </w:r>
       <w:r>
-        <w:t>PM earnings results not yet confirmed in data feed. The position returned +1.9% (WIN) against a 85% confidence call (85-94% tier). Accuracy against estimates could not be verified — trade result logged for manual review.</w:t>
+        <w:t>HOOD beat EPS estimates by +9.3% (reported $0.47 vs $0.43 expected). The position returned -21.4% (LOSS) against a 100% confidence call (95-100% tier). The model correctly identified the earnings beat but the market reacted negatively — possible guidance concerns or valuation resistance not captured in the scoring model.</w:t>
+      </w:r>
+    </w:p>
+    <w:p>
+      <w:pPr>
+        <w:jc w:val="center"/>
+      </w:pPr>
+      <w:r>
+        <w:t>────────────────────────────────────────────────────────────</w:t>
+      </w:r>
+    </w:p>
+    <w:p>
+      <w:pPr>
+        <w:pStyle w:val="Heading2"/>
+      </w:pPr>
+      <w:r>
+        <w:rPr>
+          <w:color w:val="C62828"/>
+        </w:rPr>
+        <w:t>SOFI — SoFi Technologies, Inc.  (LOSS)</w:t>
+      </w:r>
+    </w:p>
+    <w:p>
+      <w:r>
+        <w:rPr>
+          <w:b/>
+        </w:rPr>
+        <w:t xml:space="preserve">Earnings date: </w:t>
+      </w:r>
+      <w:r>
+        <w:t xml:space="preserve">2026-04-29   </w:t>
+      </w:r>
+      <w:r>
+        <w:rPr>
+          <w:b/>
+        </w:rPr>
+        <w:t xml:space="preserve">Exit: </w:t>
+      </w:r>
+      <w:r>
+        <w:t xml:space="preserve">2026-04-29   </w:t>
+      </w:r>
+      <w:r>
+        <w:rPr>
+          <w:b/>
+        </w:rPr>
+        <w:t xml:space="preserve">Confidence: </w:t>
+      </w:r>
+      <w:r>
+        <w:t>100% (95-100%)</w:t>
+      </w:r>
+    </w:p>
+    <w:p>
+      <w:r>
+        <w:rPr>
+          <w:b/>
+        </w:rPr>
+        <w:t xml:space="preserve">Entry: </w:t>
+      </w:r>
+      <w:r>
+        <w:t xml:space="preserve">$19.39   </w:t>
+      </w:r>
+      <w:r>
+        <w:rPr>
+          <w:b/>
+        </w:rPr>
+        <w:t xml:space="preserve">Exit: </w:t>
+      </w:r>
+      <w:r>
+        <w:t xml:space="preserve">$15.79   </w:t>
+      </w:r>
+      <w:r>
+        <w:rPr>
+          <w:b/>
+        </w:rPr>
+        <w:t xml:space="preserve">P&amp;L: </w:t>
+      </w:r>
+      <w:r>
+        <w:t>$-276.86 (-18.6%)</w:t>
+      </w:r>
+    </w:p>
+    <w:p>
+      <w:r>
+        <w:rPr>
+          <w:b/>
+        </w:rPr>
+        <w:t xml:space="preserve">EPS: </w:t>
+      </w:r>
+      <w:r>
+        <w:t>not available</w:t>
+      </w:r>
+    </w:p>
+    <w:p>
+      <w:r>
+        <w:rPr>
+          <w:b/>
+        </w:rPr>
+        <w:t xml:space="preserve">Call quality: </w:t>
+      </w:r>
+      <w:r>
+        <w:t>Unverified</w:t>
+      </w:r>
+    </w:p>
+    <w:p>
+      <w:r>
+        <w:rPr>
+          <w:b/>
+        </w:rPr>
+        <w:t xml:space="preserve">Analysis: </w:t>
+      </w:r>
+      <w:r>
+        <w:t>SOFI earnings results not yet confirmed in data feed. The position returned -18.6% (LOSS) against a 100% confidence call (95-100% tier). Accuracy against estimates could not be verified — trade result logged for manual review.</w:t>
+      </w:r>
+    </w:p>
+    <w:p>
+      <w:pPr>
+        <w:jc w:val="center"/>
+      </w:pPr>
+      <w:r>
+        <w:t>────────────────────────────────────────────────────────────</w:t>
+      </w:r>
+    </w:p>
+    <w:p>
+      <w:pPr>
+        <w:pStyle w:val="Heading2"/>
+      </w:pPr>
+      <w:r>
+        <w:rPr>
+          <w:color w:val="2E7D32"/>
+        </w:rPr>
+        <w:t>V — Visa Inc.  (WIN)</w:t>
+      </w:r>
+    </w:p>
+    <w:p>
+      <w:r>
+        <w:rPr>
+          <w:b/>
+        </w:rPr>
+        <w:t xml:space="preserve">Earnings date: </w:t>
+      </w:r>
+      <w:r>
+        <w:t xml:space="preserve">2026-04-28   </w:t>
+      </w:r>
+      <w:r>
+        <w:rPr>
+          <w:b/>
+        </w:rPr>
+        <w:t xml:space="preserve">Exit: </w:t>
+      </w:r>
+      <w:r>
+        <w:t xml:space="preserve">2026-04-29   </w:t>
+      </w:r>
+      <w:r>
+        <w:rPr>
+          <w:b/>
+        </w:rPr>
+        <w:t xml:space="preserve">Confidence: </w:t>
+      </w:r>
+      <w:r>
+        <w:t>85% (85-94%)</w:t>
+      </w:r>
+    </w:p>
+    <w:p>
+      <w:r>
+        <w:rPr>
+          <w:b/>
+        </w:rPr>
+        <w:t xml:space="preserve">Entry: </w:t>
+      </w:r>
+      <w:r>
+        <w:t xml:space="preserve">$317.31   </w:t>
+      </w:r>
+      <w:r>
+        <w:rPr>
+          <w:b/>
+        </w:rPr>
+        <w:t xml:space="preserve">Exit: </w:t>
+      </w:r>
+      <w:r>
+        <w:t xml:space="preserve">$336.10   </w:t>
+      </w:r>
+      <w:r>
+        <w:rPr>
+          <w:b/>
+        </w:rPr>
+        <w:t xml:space="preserve">P&amp;L: </w:t>
+      </w:r>
+      <w:r>
+        <w:t>$+18.79 (+5.9%)</w:t>
+      </w:r>
+    </w:p>
+    <w:p>
+      <w:r>
+        <w:rPr>
+          <w:b/>
+        </w:rPr>
+        <w:t xml:space="preserve">EPS: </w:t>
+      </w:r>
+      <w:r>
+        <w:t>$3.31 reported vs $3.10 est (+6.8%) — BEAT</w:t>
+      </w:r>
+    </w:p>
+    <w:p>
+      <w:r>
+        <w:rPr>
+          <w:b/>
+        </w:rPr>
+        <w:t xml:space="preserve">Call quality: </w:t>
+      </w:r>
+      <w:r>
+        <w:t>Algorithm aced the call ✓</w:t>
+      </w:r>
+    </w:p>
+    <w:p>
+      <w:r>
+        <w:rPr>
+          <w:b/>
+        </w:rPr>
+        <w:t xml:space="preserve">Analysis: </w:t>
+      </w:r>
+      <w:r>
+        <w:t>V beat EPS estimates by +6.8% (reported $3.31 vs $3.10 expected). The position returned +5.9% (WIN) against a 85% confidence call (85-94% tier). The model was well-calibrated — it correctly identified the earnings beat and the market confirmed it.</w:t>
+      </w:r>
+    </w:p>
+    <w:p>
+      <w:pPr>
+        <w:jc w:val="center"/>
+      </w:pPr>
+      <w:r>
+        <w:t>────────────────────────────────────────────────────────────</w:t>
+      </w:r>
+    </w:p>
+    <w:p>
+      <w:pPr>
+        <w:pStyle w:val="Heading2"/>
+      </w:pPr>
+      <w:r>
+        <w:rPr>
+          <w:color w:val="C62828"/>
+        </w:rPr>
+        <w:t>ABBV — AbbVie Inc.  (LOSS)</w:t>
+      </w:r>
+    </w:p>
+    <w:p>
+      <w:r>
+        <w:rPr>
+          <w:b/>
+        </w:rPr>
+        <w:t xml:space="preserve">Earnings date: </w:t>
+      </w:r>
+      <w:r>
+        <w:t xml:space="preserve">2026-04-29   </w:t>
+      </w:r>
+      <w:r>
+        <w:rPr>
+          <w:b/>
+        </w:rPr>
+        <w:t xml:space="preserve">Exit: </w:t>
+      </w:r>
+      <w:r>
+        <w:t xml:space="preserve">2026-04-29   </w:t>
+      </w:r>
+      <w:r>
+        <w:rPr>
+          <w:b/>
+        </w:rPr>
+        <w:t xml:space="preserve">Confidence: </w:t>
+      </w:r>
+      <w:r>
+        <w:t>85% (85-94%)</w:t>
+      </w:r>
+    </w:p>
+    <w:p>
+      <w:r>
+        <w:rPr>
+          <w:b/>
+        </w:rPr>
+        <w:t xml:space="preserve">Entry: </w:t>
+      </w:r>
+      <w:r>
+        <w:t xml:space="preserve">$207.46   </w:t>
+      </w:r>
+      <w:r>
+        <w:rPr>
+          <w:b/>
+        </w:rPr>
+        <w:t xml:space="preserve">Exit: </w:t>
+      </w:r>
+      <w:r>
+        <w:t xml:space="preserve">$204.03   </w:t>
+      </w:r>
+      <w:r>
+        <w:rPr>
+          <w:b/>
+        </w:rPr>
+        <w:t xml:space="preserve">P&amp;L: </w:t>
+      </w:r>
+      <w:r>
+        <w:t>$-6.86 (-1.6%)</w:t>
+      </w:r>
+    </w:p>
+    <w:p>
+      <w:r>
+        <w:rPr>
+          <w:b/>
+        </w:rPr>
+        <w:t xml:space="preserve">EPS: </w:t>
+      </w:r>
+      <w:r>
+        <w:t>not available</w:t>
+      </w:r>
+    </w:p>
+    <w:p>
+      <w:r>
+        <w:rPr>
+          <w:b/>
+        </w:rPr>
+        <w:t xml:space="preserve">Call quality: </w:t>
+      </w:r>
+      <w:r>
+        <w:t>Unverified</w:t>
+      </w:r>
+    </w:p>
+    <w:p>
+      <w:r>
+        <w:rPr>
+          <w:b/>
+        </w:rPr>
+        <w:t xml:space="preserve">Analysis: </w:t>
+      </w:r>
+      <w:r>
+        <w:t>ABBV earnings results not yet confirmed in data feed. The position returned -1.6% (LOSS) against a 85% confidence call (85-94% tier). Accuracy against estimates could not be verified — trade result logged for manual review.</w:t>
+      </w:r>
+    </w:p>
+    <w:p>
+      <w:pPr>
+        <w:jc w:val="center"/>
+      </w:pPr>
+      <w:r>
+        <w:t>────────────────────────────────────────────────────────────</w:t>
+      </w:r>
+    </w:p>
+    <w:p>
+      <w:pPr>
+        <w:pStyle w:val="Heading2"/>
+      </w:pPr>
+      <w:r>
+        <w:rPr>
+          <w:color w:val="C62828"/>
+        </w:rPr>
+        <w:t>REGN — Regeneron Pharmaceuticals, Inc.  (LOSS)</w:t>
+      </w:r>
+    </w:p>
+    <w:p>
+      <w:r>
+        <w:rPr>
+          <w:b/>
+        </w:rPr>
+        <w:t xml:space="preserve">Earnings date: </w:t>
+      </w:r>
+      <w:r>
+        <w:t xml:space="preserve">2026-04-29   </w:t>
+      </w:r>
+      <w:r>
+        <w:rPr>
+          <w:b/>
+        </w:rPr>
+        <w:t xml:space="preserve">Exit: </w:t>
+      </w:r>
+      <w:r>
+        <w:t xml:space="preserve">2026-04-29   </w:t>
+      </w:r>
+      <w:r>
+        <w:rPr>
+          <w:b/>
+        </w:rPr>
+        <w:t xml:space="preserve">Confidence: </w:t>
+      </w:r>
+      <w:r>
+        <w:t>80% (70-84%)</w:t>
+      </w:r>
+    </w:p>
+    <w:p>
+      <w:r>
+        <w:rPr>
+          <w:b/>
+        </w:rPr>
+        <w:t xml:space="preserve">Entry: </w:t>
+      </w:r>
+      <w:r>
+        <w:t xml:space="preserve">$750.01   </w:t>
+      </w:r>
+      <w:r>
+        <w:rPr>
+          <w:b/>
+        </w:rPr>
+        <w:t xml:space="preserve">Exit: </w:t>
+      </w:r>
+      <w:r>
+        <w:t xml:space="preserve">$686.64   </w:t>
+      </w:r>
+      <w:r>
+        <w:rPr>
+          <w:b/>
+        </w:rPr>
+        <w:t xml:space="preserve">P&amp;L: </w:t>
+      </w:r>
+      <w:r>
+        <w:t>$-63.37 (-8.4%)</w:t>
+      </w:r>
+    </w:p>
+    <w:p>
+      <w:r>
+        <w:rPr>
+          <w:b/>
+        </w:rPr>
+        <w:t xml:space="preserve">EPS: </w:t>
+      </w:r>
+      <w:r>
+        <w:t>$9.47 reported vs $8.90 est (+6.4%) — BEAT</w:t>
+      </w:r>
+    </w:p>
+    <w:p>
+      <w:r>
+        <w:rPr>
+          <w:b/>
+        </w:rPr>
+        <w:t xml:space="preserve">Call quality: </w:t>
+      </w:r>
+      <w:r>
+        <w:t>Algorithm missed the call ✗</w:t>
+      </w:r>
+    </w:p>
+    <w:p>
+      <w:r>
+        <w:rPr>
+          <w:b/>
+        </w:rPr>
+        <w:t xml:space="preserve">Analysis: </w:t>
+      </w:r>
+      <w:r>
+        <w:t>REGN beat EPS estimates by +6.4% (reported $9.47 vs $8.90 expected). The position returned -8.4% (LOSS) against a 80% confidence call (70-84% tier). The model correctly identified the earnings beat but the market reacted negatively — possible guidance concerns or valuation resistance not captured in the scoring model.</w:t>
+      </w:r>
+    </w:p>
+    <w:p>
+      <w:pPr>
+        <w:jc w:val="center"/>
+      </w:pPr>
+      <w:r>
+        <w:t>────────────────────────────────────────────────────────────</w:t>
+      </w:r>
+    </w:p>
+    <w:p>
+      <w:pPr>
+        <w:pStyle w:val="Heading2"/>
+      </w:pPr>
+      <w:r>
+        <w:rPr>
+          <w:color w:val="C62828"/>
+        </w:rPr>
+        <w:t>TMO — Thermo Fisher Scientific Inc.  (LOSS)</w:t>
+      </w:r>
+    </w:p>
+    <w:p>
+      <w:r>
+        <w:rPr>
+          <w:b/>
+        </w:rPr>
+        <w:t xml:space="preserve">Earnings date: </w:t>
+      </w:r>
+      <w:r>
+        <w:t xml:space="preserve">2026-04-23   </w:t>
+      </w:r>
+      <w:r>
+        <w:rPr>
+          <w:b/>
+        </w:rPr>
+        <w:t xml:space="preserve">Exit: </w:t>
+      </w:r>
+      <w:r>
+        <w:t xml:space="preserve">2026-04-23   </w:t>
+      </w:r>
+      <w:r>
+        <w:rPr>
+          <w:b/>
+        </w:rPr>
+        <w:t xml:space="preserve">Confidence: </w:t>
+      </w:r>
+      <w:r>
+        <w:t>100% (95-100%)</w:t>
+      </w:r>
+    </w:p>
+    <w:p>
+      <w:r>
+        <w:rPr>
+          <w:b/>
+        </w:rPr>
+        <w:t xml:space="preserve">Entry: </w:t>
+      </w:r>
+      <w:r>
+        <w:t xml:space="preserve">$523.98   </w:t>
+      </w:r>
+      <w:r>
+        <w:rPr>
+          <w:b/>
+        </w:rPr>
+        <w:t xml:space="preserve">Exit: </w:t>
+      </w:r>
+      <w:r>
+        <w:t xml:space="preserve">$460.75   </w:t>
+      </w:r>
+      <w:r>
+        <w:rPr>
+          <w:b/>
+        </w:rPr>
+        <w:t xml:space="preserve">P&amp;L: </w:t>
+      </w:r>
+      <w:r>
+        <w:t>$-126.46 (-12.1%)</w:t>
+      </w:r>
+    </w:p>
+    <w:p>
+      <w:r>
+        <w:rPr>
+          <w:b/>
+        </w:rPr>
+        <w:t xml:space="preserve">EPS: </w:t>
+      </w:r>
+      <w:r>
+        <w:t>$5.44 reported vs $5.24 est (+3.8%) — BEAT</w:t>
+      </w:r>
+    </w:p>
+    <w:p>
+      <w:r>
+        <w:rPr>
+          <w:b/>
+        </w:rPr>
+        <w:t xml:space="preserve">Call quality: </w:t>
+      </w:r>
+      <w:r>
+        <w:t>Algorithm missed the call ✗</w:t>
+      </w:r>
+    </w:p>
+    <w:p>
+      <w:r>
+        <w:rPr>
+          <w:b/>
+        </w:rPr>
+        <w:t xml:space="preserve">Analysis: </w:t>
+      </w:r>
+      <w:r>
+        <w:t>TMO beat EPS estimates by +3.8% (reported $5.44 vs $5.24 expected). The position returned -12.1% (LOSS) against a 100% confidence call (95-100% tier). The model correctly identified the earnings beat but the market reacted negatively — possible guidance concerns or valuation resistance not captured in the scoring model.</w:t>
+      </w:r>
+    </w:p>
+    <w:p>
+      <w:pPr>
+        <w:jc w:val="center"/>
+      </w:pPr>
+      <w:r>
+        <w:t>────────────────────────────────────────────────────────────</w:t>
+      </w:r>
+    </w:p>
+    <w:p>
+      <w:pPr>
+        <w:pStyle w:val="Heading2"/>
+      </w:pPr>
+      <w:r>
+        <w:rPr>
+          <w:color w:val="C62828"/>
+        </w:rPr>
+        <w:t>AXP — American Express Company  (LOSS)</w:t>
+      </w:r>
+    </w:p>
+    <w:p>
+      <w:r>
+        <w:rPr>
+          <w:b/>
+        </w:rPr>
+        <w:t xml:space="preserve">Earnings date: </w:t>
+      </w:r>
+      <w:r>
+        <w:t xml:space="preserve">2026-04-23   </w:t>
+      </w:r>
+      <w:r>
+        <w:rPr>
+          <w:b/>
+        </w:rPr>
+        <w:t xml:space="preserve">Exit: </w:t>
+      </w:r>
+      <w:r>
+        <w:t xml:space="preserve">2026-04-23   </w:t>
+      </w:r>
+      <w:r>
+        <w:rPr>
+          <w:b/>
+        </w:rPr>
+        <w:t xml:space="preserve">Confidence: </w:t>
+      </w:r>
+      <w:r>
+        <w:t>100% (95-100%)</w:t>
+      </w:r>
+    </w:p>
+    <w:p>
+      <w:r>
+        <w:rPr>
+          <w:b/>
+        </w:rPr>
+        <w:t xml:space="preserve">Entry: </w:t>
+      </w:r>
+      <w:r>
+        <w:t xml:space="preserve">$334.36   </w:t>
+      </w:r>
+      <w:r>
+        <w:rPr>
+          <w:b/>
+        </w:rPr>
+        <w:t xml:space="preserve">Exit: </w:t>
+      </w:r>
+      <w:r>
+        <w:t xml:space="preserve">$321.89   </w:t>
+      </w:r>
+      <w:r>
+        <w:rPr>
+          <w:b/>
+        </w:rPr>
+        <w:t xml:space="preserve">P&amp;L: </w:t>
+      </w:r>
+      <w:r>
+        <w:t>$-49.87 (-3.7%)</w:t>
+      </w:r>
+    </w:p>
+    <w:p>
+      <w:r>
+        <w:rPr>
+          <w:b/>
+        </w:rPr>
+        <w:t xml:space="preserve">EPS: </w:t>
+      </w:r>
+      <w:r>
+        <w:t>$4.28 reported vs $3.99 est (+7.3%) — BEAT</w:t>
+      </w:r>
+    </w:p>
+    <w:p>
+      <w:r>
+        <w:rPr>
+          <w:b/>
+        </w:rPr>
+        <w:t xml:space="preserve">Call quality: </w:t>
+      </w:r>
+      <w:r>
+        <w:t>Algorithm missed the call ✗</w:t>
+      </w:r>
+    </w:p>
+    <w:p>
+      <w:r>
+        <w:rPr>
+          <w:b/>
+        </w:rPr>
+        <w:t xml:space="preserve">Analysis: </w:t>
+      </w:r>
+      <w:r>
+        <w:t>AXP beat EPS estimates by +7.3% (reported $4.28 vs $3.99 expected). The position returned -3.7% (LOSS) against a 100% confidence call (95-100% tier). The model correctly identified the earnings beat but the market reacted negatively — possible guidance concerns or valuation resistance not captured in the scoring model.</w:t>
+      </w:r>
+    </w:p>
+    <w:p>
+      <w:pPr>
+        <w:jc w:val="center"/>
+      </w:pPr>
+      <w:r>
+        <w:t>────────────────────────────────────────────────────────────</w:t>
+      </w:r>
+    </w:p>
+    <w:p>
+      <w:pPr>
+        <w:pStyle w:val="Heading2"/>
+      </w:pPr>
+      <w:r>
+        <w:rPr>
+          <w:color w:val="C62828"/>
+        </w:rPr>
+        <w:t>LRCX — Lam Research Corporation  (LOSS)</w:t>
+      </w:r>
+    </w:p>
+    <w:p>
+      <w:r>
+        <w:rPr>
+          <w:b/>
+        </w:rPr>
+        <w:t xml:space="preserve">Earnings date: </w:t>
+      </w:r>
+      <w:r>
+        <w:t xml:space="preserve">2026-04-22   </w:t>
+      </w:r>
+      <w:r>
+        <w:rPr>
+          <w:b/>
+        </w:rPr>
+        <w:t xml:space="preserve">Exit: </w:t>
+      </w:r>
+      <w:r>
+        <w:t xml:space="preserve">2026-04-23   </w:t>
+      </w:r>
+      <w:r>
+        <w:rPr>
+          <w:b/>
+        </w:rPr>
+        <w:t xml:space="preserve">Confidence: </w:t>
+      </w:r>
+      <w:r>
+        <w:t>100% (95-100%)</w:t>
+      </w:r>
+    </w:p>
+    <w:p>
+      <w:r>
+        <w:rPr>
+          <w:b/>
+        </w:rPr>
+        <w:t xml:space="preserve">Entry: </w:t>
+      </w:r>
+      <w:r>
+        <w:t xml:space="preserve">$264.70   </w:t>
+      </w:r>
+      <w:r>
+        <w:rPr>
+          <w:b/>
+        </w:rPr>
+        <w:t xml:space="preserve">Exit: </w:t>
+      </w:r>
+      <w:r>
+        <w:t xml:space="preserve">$263.05   </w:t>
+      </w:r>
+      <w:r>
+        <w:rPr>
+          <w:b/>
+        </w:rPr>
+        <w:t xml:space="preserve">P&amp;L: </w:t>
+      </w:r>
+      <w:r>
+        <w:t>$-8.23 (-0.6%)</w:t>
+      </w:r>
+    </w:p>
+    <w:p>
+      <w:r>
+        <w:rPr>
+          <w:b/>
+        </w:rPr>
+        <w:t xml:space="preserve">EPS: </w:t>
+      </w:r>
+      <w:r>
+        <w:t>$1.47 reported vs $1.36 est (+8.1%) — BEAT</w:t>
+      </w:r>
+    </w:p>
+    <w:p>
+      <w:r>
+        <w:rPr>
+          <w:b/>
+        </w:rPr>
+        <w:t xml:space="preserve">Call quality: </w:t>
+      </w:r>
+      <w:r>
+        <w:t>Algorithm missed the call ✗</w:t>
+      </w:r>
+    </w:p>
+    <w:p>
+      <w:r>
+        <w:rPr>
+          <w:b/>
+        </w:rPr>
+        <w:t xml:space="preserve">Analysis: </w:t>
+      </w:r>
+      <w:r>
+        <w:t>LRCX beat EPS estimates by +8.1% (reported $1.47 vs $1.36 expected). The position returned -0.6% (LOSS) against a 100% confidence call (95-100% tier). The model correctly identified the earnings beat but the market reacted negatively — possible guidance concerns or valuation resistance not captured in the scoring model.</w:t>
+      </w:r>
+    </w:p>
+    <w:p>
+      <w:pPr>
+        <w:jc w:val="center"/>
+      </w:pPr>
+      <w:r>
+        <w:t>────────────────────────────────────────────────────────────</w:t>
+      </w:r>
+    </w:p>
+    <w:p>
+      <w:pPr>
+        <w:pStyle w:val="Heading2"/>
+      </w:pPr>
+      <w:r>
+        <w:rPr>
+          <w:color w:val="C62828"/>
+        </w:rPr>
+        <w:t>HON — Honeywell International Inc.  (LOSS)</w:t>
+      </w:r>
+    </w:p>
+    <w:p>
+      <w:r>
+        <w:rPr>
+          <w:b/>
+        </w:rPr>
+        <w:t xml:space="preserve">Earnings date: </w:t>
+      </w:r>
+      <w:r>
+        <w:t xml:space="preserve">2026-04-23   </w:t>
+      </w:r>
+      <w:r>
+        <w:rPr>
+          <w:b/>
+        </w:rPr>
+        <w:t xml:space="preserve">Exit: </w:t>
+      </w:r>
+      <w:r>
+        <w:t xml:space="preserve">2026-04-23   </w:t>
+      </w:r>
+      <w:r>
+        <w:rPr>
+          <w:b/>
+        </w:rPr>
+        <w:t xml:space="preserve">Confidence: </w:t>
+      </w:r>
+      <w:r>
+        <w:t>85% (85-94%)</w:t>
+      </w:r>
+    </w:p>
+    <w:p>
+      <w:r>
+        <w:rPr>
+          <w:b/>
+        </w:rPr>
+        <w:t xml:space="preserve">Entry: </w:t>
+      </w:r>
+      <w:r>
+        <w:t xml:space="preserve">$232.28   </w:t>
+      </w:r>
+      <w:r>
+        <w:rPr>
+          <w:b/>
+        </w:rPr>
+        <w:t xml:space="preserve">Exit: </w:t>
+      </w:r>
+      <w:r>
+        <w:t xml:space="preserve">$213.80   </w:t>
+      </w:r>
+      <w:r>
+        <w:rPr>
+          <w:b/>
+        </w:rPr>
+        <w:t xml:space="preserve">P&amp;L: </w:t>
+      </w:r>
+      <w:r>
+        <w:t>$-36.96 (-8.0%)</w:t>
+      </w:r>
+    </w:p>
+    <w:p>
+      <w:r>
+        <w:rPr>
+          <w:b/>
+        </w:rPr>
+        <w:t xml:space="preserve">EPS: </w:t>
+      </w:r>
+      <w:r>
+        <w:t>$2.45 reported vs $2.32 est (+5.6%) — BEAT</w:t>
+      </w:r>
+    </w:p>
+    <w:p>
+      <w:r>
+        <w:rPr>
+          <w:b/>
+        </w:rPr>
+        <w:t xml:space="preserve">Call quality: </w:t>
+      </w:r>
+      <w:r>
+        <w:t>Algorithm missed the call ✗</w:t>
+      </w:r>
+    </w:p>
+    <w:p>
+      <w:r>
+        <w:rPr>
+          <w:b/>
+        </w:rPr>
+        <w:t xml:space="preserve">Analysis: </w:t>
+      </w:r>
+      <w:r>
+        <w:t>HON beat EPS estimates by +5.6% (reported $2.45 vs $2.32 expected). The position returned -8.0% (LOSS) against a 85% confidence call (85-94% tier). The model correctly identified the earnings beat but the market reacted negatively — possible guidance concerns or valuation resistance not captured in the scoring model.</w:t>
+      </w:r>
+    </w:p>
+    <w:p>
+      <w:pPr>
+        <w:jc w:val="center"/>
+      </w:pPr>
+      <w:r>
+        <w:t>────────────────────────────────────────────────────────────</w:t>
+      </w:r>
+    </w:p>
+    <w:p>
+      <w:pPr>
+        <w:pStyle w:val="Heading2"/>
+      </w:pPr>
+      <w:r>
+        <w:rPr>
+          <w:color w:val="2E7D32"/>
+        </w:rPr>
+        <w:t>TXN — Texas Instruments Incorporated  (WIN)</w:t>
+      </w:r>
+    </w:p>
+    <w:p>
+      <w:r>
+        <w:rPr>
+          <w:b/>
+        </w:rPr>
+        <w:t xml:space="preserve">Earnings date: </w:t>
+      </w:r>
+      <w:r>
+        <w:t xml:space="preserve">2026-04-22   </w:t>
+      </w:r>
+      <w:r>
+        <w:rPr>
+          <w:b/>
+        </w:rPr>
+        <w:t xml:space="preserve">Exit: </w:t>
+      </w:r>
+      <w:r>
+        <w:t xml:space="preserve">2026-04-23   </w:t>
+      </w:r>
+      <w:r>
+        <w:rPr>
+          <w:b/>
+        </w:rPr>
+        <w:t xml:space="preserve">Confidence: </w:t>
+      </w:r>
+      <w:r>
+        <w:t>75% (70-84%)</w:t>
+      </w:r>
+    </w:p>
+    <w:p>
+      <w:r>
+        <w:rPr>
+          <w:b/>
+        </w:rPr>
+        <w:t xml:space="preserve">Entry: </w:t>
+      </w:r>
+      <w:r>
+        <w:t xml:space="preserve">$230.69   </w:t>
+      </w:r>
+      <w:r>
+        <w:rPr>
+          <w:b/>
+        </w:rPr>
+        <w:t xml:space="preserve">Exit: </w:t>
+      </w:r>
+      <w:r>
+        <w:t xml:space="preserve">$279.82   </w:t>
+      </w:r>
+      <w:r>
+        <w:rPr>
+          <w:b/>
+        </w:rPr>
+        <w:t xml:space="preserve">P&amp;L: </w:t>
+      </w:r>
+      <w:r>
+        <w:t>$+98.26 (+21.3%)</w:t>
+      </w:r>
+    </w:p>
+    <w:p>
+      <w:r>
+        <w:rPr>
+          <w:b/>
+        </w:rPr>
+        <w:t xml:space="preserve">EPS: </w:t>
+      </w:r>
+      <w:r>
+        <w:t>$1.68 reported vs $1.36 est (+23.5%) — BEAT</w:t>
+      </w:r>
+    </w:p>
+    <w:p>
+      <w:r>
+        <w:rPr>
+          <w:b/>
+        </w:rPr>
+        <w:t xml:space="preserve">Call quality: </w:t>
+      </w:r>
+      <w:r>
+        <w:t>Algorithm aced the call ✓</w:t>
+      </w:r>
+    </w:p>
+    <w:p>
+      <w:r>
+        <w:rPr>
+          <w:b/>
+        </w:rPr>
+        <w:t xml:space="preserve">Analysis: </w:t>
+      </w:r>
+      <w:r>
+        <w:t>TXN beat EPS estimates by +23.5% (reported $1.68 vs $1.36 expected). The position returned +21.3% (WIN) against a 75% confidence call (70-84% tier). The model was well-calibrated — it correctly identified the earnings beat and the market confirmed it.</w:t>
+      </w:r>
+    </w:p>
+    <w:p>
+      <w:pPr>
+        <w:jc w:val="center"/>
+      </w:pPr>
+      <w:r>
+        <w:t>────────────────────────────────────────────────────────────</w:t>
+      </w:r>
+    </w:p>
+    <w:p>
+      <w:pPr>
+        <w:pStyle w:val="Heading2"/>
+      </w:pPr>
+      <w:r>
+        <w:rPr>
+          <w:color w:val="C62828"/>
+        </w:rPr>
+        <w:t>NOW — ServiceNow, Inc.  (LOSS)</w:t>
+      </w:r>
+    </w:p>
+    <w:p>
+      <w:r>
+        <w:rPr>
+          <w:b/>
+        </w:rPr>
+        <w:t xml:space="preserve">Earnings date: </w:t>
+      </w:r>
+      <w:r>
+        <w:t xml:space="preserve">2026-04-22   </w:t>
+      </w:r>
+      <w:r>
+        <w:rPr>
+          <w:b/>
+        </w:rPr>
+        <w:t xml:space="preserve">Exit: </w:t>
+      </w:r>
+      <w:r>
+        <w:t xml:space="preserve">2026-04-23   </w:t>
+      </w:r>
+      <w:r>
+        <w:rPr>
+          <w:b/>
+        </w:rPr>
+        <w:t xml:space="preserve">Confidence: </w:t>
+      </w:r>
+      <w:r>
+        <w:t>95% (95-100%)</w:t>
+      </w:r>
+    </w:p>
+    <w:p>
+      <w:r>
+        <w:rPr>
+          <w:b/>
+        </w:rPr>
+        <w:t xml:space="preserve">Entry: </w:t>
+      </w:r>
+      <w:r>
+        <w:t xml:space="preserve">$99.04   </w:t>
+      </w:r>
+      <w:r>
+        <w:rPr>
+          <w:b/>
+        </w:rPr>
+        <w:t xml:space="preserve">Exit: </w:t>
+      </w:r>
+      <w:r>
+        <w:t xml:space="preserve">$85.29   </w:t>
+      </w:r>
+      <w:r>
+        <w:rPr>
+          <w:b/>
+        </w:rPr>
+        <w:t xml:space="preserve">P&amp;L: </w:t>
+      </w:r>
+      <w:r>
+        <w:t>$-206.25 (-13.9%)</w:t>
+      </w:r>
+    </w:p>
+    <w:p>
+      <w:r>
+        <w:rPr>
+          <w:b/>
+        </w:rPr>
+        <w:t xml:space="preserve">EPS: </w:t>
+      </w:r>
+      <w:r>
+        <w:t>$0.97 reported vs $0.97 est (+0.0%) — MISS</w:t>
+      </w:r>
+    </w:p>
+    <w:p>
+      <w:r>
+        <w:rPr>
+          <w:b/>
+        </w:rPr>
+        <w:t xml:space="preserve">Call quality: </w:t>
+      </w:r>
+      <w:r>
+        <w:t>Algorithm aced the call ✓</w:t>
+      </w:r>
+    </w:p>
+    <w:p>
+      <w:r>
+        <w:rPr>
+          <w:b/>
+        </w:rPr>
+        <w:t xml:space="preserve">Analysis: </w:t>
+      </w:r>
+      <w:r>
+        <w:t>NOW missed EPS estimates by 0.0% (reported $0.97 vs $0.97 expected). The position returned -13.9% (LOSS) against a 95% confidence call (95-100% tier). The model correctly anticipated downside risk; both the earnings miss and the market reaction aligned with the 95-100% tier prediction.</w:t>
+      </w:r>
+    </w:p>
+    <w:p>
+      <w:pPr>
+        <w:jc w:val="center"/>
+      </w:pPr>
+      <w:r>
+        <w:t>────────────────────────────────────────────────────────────</w:t>
+      </w:r>
+    </w:p>
+    <w:p>
+      <w:pPr>
+        <w:pStyle w:val="Heading2"/>
+      </w:pPr>
+      <w:r>
+        <w:rPr>
+          <w:color w:val="C62828"/>
+        </w:rPr>
+        <w:t>IBM — International Business Machines Corporation  (LOSS)</w:t>
+      </w:r>
+    </w:p>
+    <w:p>
+      <w:r>
+        <w:rPr>
+          <w:b/>
+        </w:rPr>
+        <w:t xml:space="preserve">Earnings date: </w:t>
+      </w:r>
+      <w:r>
+        <w:t xml:space="preserve">2026-04-22   </w:t>
+      </w:r>
+      <w:r>
+        <w:rPr>
+          <w:b/>
+        </w:rPr>
+        <w:t xml:space="preserve">Exit: </w:t>
+      </w:r>
+      <w:r>
+        <w:t xml:space="preserve">2026-04-23   </w:t>
+      </w:r>
+      <w:r>
+        <w:rPr>
+          <w:b/>
+        </w:rPr>
+        <w:t xml:space="preserve">Confidence: </w:t>
+      </w:r>
+      <w:r>
+        <w:t>90% (85-94%)</w:t>
+      </w:r>
+    </w:p>
+    <w:p>
+      <w:r>
+        <w:rPr>
+          <w:b/>
+        </w:rPr>
+        <w:t xml:space="preserve">Entry: </w:t>
+      </w:r>
+      <w:r>
+        <w:t xml:space="preserve">$252.96   </w:t>
+      </w:r>
+      <w:r>
+        <w:rPr>
+          <w:b/>
+        </w:rPr>
+        <w:t xml:space="preserve">Exit: </w:t>
+      </w:r>
+      <w:r>
+        <w:t xml:space="preserve">$230.98   </w:t>
+      </w:r>
+      <w:r>
+        <w:rPr>
+          <w:b/>
+        </w:rPr>
+        <w:t xml:space="preserve">P&amp;L: </w:t>
+      </w:r>
+      <w:r>
+        <w:t>$-65.93 (-8.7%)</w:t>
+      </w:r>
+    </w:p>
+    <w:p>
+      <w:r>
+        <w:rPr>
+          <w:b/>
+        </w:rPr>
+        <w:t xml:space="preserve">EPS: </w:t>
+      </w:r>
+      <w:r>
+        <w:t>$1.91 reported vs $1.81 est (+5.5%) — BEAT</w:t>
+      </w:r>
+    </w:p>
+    <w:p>
+      <w:r>
+        <w:rPr>
+          <w:b/>
+        </w:rPr>
+        <w:t xml:space="preserve">Call quality: </w:t>
+      </w:r>
+      <w:r>
+        <w:t>Algorithm missed the call ✗</w:t>
+      </w:r>
+    </w:p>
+    <w:p>
+      <w:r>
+        <w:rPr>
+          <w:b/>
+        </w:rPr>
+        <w:t xml:space="preserve">Analysis: </w:t>
+      </w:r>
+      <w:r>
+        <w:t>IBM beat EPS estimates by +5.5% (reported $1.91 vs $1.81 expected). The position returned -8.7% (LOSS) against a 90% confidence call (85-94% tier). The model correctly identified the earnings beat but the market reacted negatively — possible guidance concerns or valuation resistance not captured in the scoring model.</w:t>
+      </w:r>
+    </w:p>
+    <w:p>
+      <w:pPr>
+        <w:jc w:val="center"/>
+      </w:pPr>
+      <w:r>
+        <w:t>────────────────────────────────────────────────────────────</w:t>
+      </w:r>
+    </w:p>
+    <w:p>
+      <w:pPr>
+        <w:pStyle w:val="Heading2"/>
+      </w:pPr>
+      <w:r>
+        <w:rPr>
+          <w:color w:val="2E7D32"/>
+        </w:rPr>
+        <w:t>NEE — NextEra Energy, Inc.  (WIN)</w:t>
+      </w:r>
+    </w:p>
+    <w:p>
+      <w:r>
+        <w:rPr>
+          <w:b/>
+        </w:rPr>
+        <w:t xml:space="preserve">Earnings date: </w:t>
+      </w:r>
+      <w:r>
+        <w:t xml:space="preserve">2026-04-23   </w:t>
+      </w:r>
+      <w:r>
+        <w:rPr>
+          <w:b/>
+        </w:rPr>
+        <w:t xml:space="preserve">Exit: </w:t>
+      </w:r>
+      <w:r>
+        <w:t xml:space="preserve">2026-04-23   </w:t>
+      </w:r>
+      <w:r>
+        <w:rPr>
+          <w:b/>
+        </w:rPr>
+        <w:t xml:space="preserve">Confidence: </w:t>
+      </w:r>
+      <w:r>
+        <w:t>85% (85-94%)</w:t>
+      </w:r>
+    </w:p>
+    <w:p>
+      <w:r>
+        <w:rPr>
+          <w:b/>
+        </w:rPr>
+        <w:t xml:space="preserve">Entry: </w:t>
+      </w:r>
+      <w:r>
+        <w:t xml:space="preserve">$92.35   </w:t>
+      </w:r>
+      <w:r>
+        <w:rPr>
+          <w:b/>
+        </w:rPr>
+        <w:t xml:space="preserve">Exit: </w:t>
+      </w:r>
+      <w:r>
+        <w:t xml:space="preserve">$95.92   </w:t>
+      </w:r>
+      <w:r>
+        <w:rPr>
+          <w:b/>
+        </w:rPr>
+        <w:t xml:space="preserve">P&amp;L: </w:t>
+      </w:r>
+      <w:r>
+        <w:t>$+17.85 (+3.9%)</w:t>
+      </w:r>
+    </w:p>
+    <w:p>
+      <w:r>
+        <w:rPr>
+          <w:b/>
+        </w:rPr>
+        <w:t xml:space="preserve">EPS: </w:t>
+      </w:r>
+      <w:r>
+        <w:t>$1.09 reported vs $1.03 est (+5.8%) — BEAT</w:t>
+      </w:r>
+    </w:p>
+    <w:p>
+      <w:r>
+        <w:rPr>
+          <w:b/>
+        </w:rPr>
+        <w:t xml:space="preserve">Call quality: </w:t>
+      </w:r>
+      <w:r>
+        <w:t>Algorithm aced the call ✓</w:t>
+      </w:r>
+    </w:p>
+    <w:p>
+      <w:r>
+        <w:rPr>
+          <w:b/>
+        </w:rPr>
+        <w:t xml:space="preserve">Analysis: </w:t>
+      </w:r>
+      <w:r>
+        <w:t>NEE beat EPS estimates by +5.8% (reported $1.09 vs $1.03 expected). The position returned +3.9% (WIN) against a 85% confidence call (85-94% tier). The model was well-calibrated — it correctly identified the earnings beat and the market confirmed it.</w:t>
+      </w:r>
+    </w:p>
+    <w:p>
+      <w:pPr>
+        <w:jc w:val="center"/>
+      </w:pPr>
+      <w:r>
+        <w:t>────────────────────────────────────────────────────────────</w:t>
+      </w:r>
+    </w:p>
+    <w:p>
+      <w:pPr>
+        <w:pStyle w:val="Heading2"/>
+      </w:pPr>
+      <w:r>
+        <w:rPr>
+          <w:color w:val="2E7D32"/>
+        </w:rPr>
+        <w:t>ISRG — Intuitive Surgical, Inc.  (WIN)</w:t>
+      </w:r>
+    </w:p>
+    <w:p>
+      <w:r>
+        <w:rPr>
+          <w:b/>
+        </w:rPr>
+        <w:t xml:space="preserve">Earnings date: </w:t>
+      </w:r>
+      <w:r>
+        <w:t xml:space="preserve">2026-04-21   </w:t>
+      </w:r>
+      <w:r>
+        <w:rPr>
+          <w:b/>
+        </w:rPr>
+        <w:t xml:space="preserve">Exit: </w:t>
+      </w:r>
+      <w:r>
+        <w:t xml:space="preserve">2026-04-22   </w:t>
+      </w:r>
+      <w:r>
+        <w:rPr>
+          <w:b/>
+        </w:rPr>
+        <w:t xml:space="preserve">Confidence: </w:t>
+      </w:r>
+      <w:r>
+        <w:t>100% (95-100%)</w:t>
+      </w:r>
+    </w:p>
+    <w:p>
+      <w:r>
+        <w:rPr>
+          <w:b/>
+        </w:rPr>
+        <w:t xml:space="preserve">Entry: </w:t>
+      </w:r>
+      <w:r>
+        <w:t xml:space="preserve">$470.28   </w:t>
+      </w:r>
+      <w:r>
+        <w:rPr>
+          <w:b/>
+        </w:rPr>
+        <w:t xml:space="preserve">Exit: </w:t>
+      </w:r>
+      <w:r>
+        <w:t xml:space="preserve">$488.21   </w:t>
+      </w:r>
+      <w:r>
+        <w:rPr>
+          <w:b/>
+        </w:rPr>
+        <w:t xml:space="preserve">P&amp;L: </w:t>
+      </w:r>
+      <w:r>
+        <w:t>$+53.80 (+3.8%)</w:t>
+      </w:r>
+    </w:p>
+    <w:p>
+      <w:r>
+        <w:rPr>
+          <w:b/>
+        </w:rPr>
+        <w:t xml:space="preserve">EPS: </w:t>
+      </w:r>
+      <w:r>
+        <w:t>$2.28 reported vs $1.93 est (+18.1%) — BEAT</w:t>
+      </w:r>
+    </w:p>
+    <w:p>
+      <w:r>
+        <w:rPr>
+          <w:b/>
+        </w:rPr>
+        <w:t xml:space="preserve">Call quality: </w:t>
+      </w:r>
+      <w:r>
+        <w:t>Algorithm aced the call ✓</w:t>
+      </w:r>
+    </w:p>
+    <w:p>
+      <w:r>
+        <w:rPr>
+          <w:b/>
+        </w:rPr>
+        <w:t xml:space="preserve">Analysis: </w:t>
+      </w:r>
+      <w:r>
+        <w:t>ISRG beat EPS estimates by +18.1% (reported $2.28 vs $1.93 expected). The position returned +3.8% (WIN) against a 100% confidence call (95-100% tier). The model was well-calibrated — it correctly identified the earnings beat and the market confirmed it.</w:t>
+      </w:r>
+    </w:p>
+    <w:p>
+      <w:pPr>
+        <w:jc w:val="center"/>
+      </w:pPr>
+      <w:r>
+        <w:t>────────────────────────────────────────────────────────────</w:t>
+      </w:r>
+    </w:p>
+    <w:p>
+      <w:pPr>
+        <w:pStyle w:val="Heading2"/>
+      </w:pPr>
+      <w:r>
+        <w:rPr>
+          <w:color w:val="2E7D32"/>
+        </w:rPr>
+        <w:t>PM — Philip Morris International Inc.  (WIN)</w:t>
+      </w:r>
+    </w:p>
+    <w:p>
+      <w:r>
+        <w:rPr>
+          <w:b/>
+        </w:rPr>
+        <w:t xml:space="preserve">Earnings date: </w:t>
+      </w:r>
+      <w:r>
+        <w:t xml:space="preserve">2026-04-22   </w:t>
+      </w:r>
+      <w:r>
+        <w:rPr>
+          <w:b/>
+        </w:rPr>
+        <w:t xml:space="preserve">Exit: </w:t>
+      </w:r>
+      <w:r>
+        <w:t xml:space="preserve">2026-04-22   </w:t>
+      </w:r>
+      <w:r>
+        <w:rPr>
+          <w:b/>
+        </w:rPr>
+        <w:t xml:space="preserve">Confidence: </w:t>
+      </w:r>
+      <w:r>
+        <w:t>85% (85-94%)</w:t>
+      </w:r>
+    </w:p>
+    <w:p>
+      <w:r>
+        <w:rPr>
+          <w:b/>
+        </w:rPr>
+        <w:t xml:space="preserve">Entry: </w:t>
+      </w:r>
+      <w:r>
+        <w:t xml:space="preserve">$159.50   </w:t>
+      </w:r>
+      <w:r>
+        <w:rPr>
+          <w:b/>
+        </w:rPr>
+        <w:t xml:space="preserve">Exit: </w:t>
+      </w:r>
+      <w:r>
+        <w:t xml:space="preserve">$162.52   </w:t>
+      </w:r>
+      <w:r>
+        <w:rPr>
+          <w:b/>
+        </w:rPr>
+        <w:t xml:space="preserve">P&amp;L: </w:t>
+      </w:r>
+      <w:r>
+        <w:t>$+9.05 (+1.9%)</w:t>
+      </w:r>
+    </w:p>
+    <w:p>
+      <w:r>
+        <w:rPr>
+          <w:b/>
+        </w:rPr>
+        <w:t xml:space="preserve">EPS: </w:t>
+      </w:r>
+      <w:r>
+        <w:t>$1.56 reported vs $1.74 est (-10.3%) — MISS</w:t>
+      </w:r>
+    </w:p>
+    <w:p>
+      <w:r>
+        <w:rPr>
+          <w:b/>
+        </w:rPr>
+        <w:t xml:space="preserve">Call quality: </w:t>
+      </w:r>
+      <w:r>
+        <w:t>Algorithm missed the call ✗</w:t>
+      </w:r>
+    </w:p>
+    <w:p>
+      <w:r>
+        <w:rPr>
+          <w:b/>
+        </w:rPr>
+        <w:t xml:space="preserve">Analysis: </w:t>
+      </w:r>
+      <w:r>
+        <w:t>PM missed EPS estimates by 10.3% (reported $1.56 vs $1.74 expected). The position returned +1.9% (WIN) against a 85% confidence call (85-94% tier). Despite the EPS miss the position was profitable — possible forward guidance upgrade or short squeeze not captured by the scoring model.</w:t>
       </w:r>
     </w:p>
     <w:p>

</xml_diff>

<commit_message>
Add daily reports May 5-6; backfill PLTR price_up_5pct_rate; fix reporter --date arg
- reports/Daily Model Movement/report_2026-05-05.html: PLTR closed -$122.22 (-8.98%)
- reports/Daily Model Movement/report_2026-05-06.html: AMD +$603 WIN, SHOP -$76 LOSS
- reporter.py: add --date argument for historical report generation
- data/trades_history.json: PLTR price_up_5pct_rate = 0.6923 (passes dual-filter)
- earnings_calls_log: PLTR, AMD, SHOP logged with EPS analysis
- .gitignore: unblock reports/Daily Model Movement/ so reports commit going forward

Co-Authored-By: Claude Sonnet 4.6 <noreply@anthropic.com>
</commit_message>
<xml_diff>
--- a/data/earnings_calls_log.docx
+++ b/data/earnings_calls_log.docx
@@ -20,7 +20,7 @@
           <w:i/>
           <w:sz w:val="20"/>
         </w:rPr>
-        <w:t>Generated 2026-05-05 17:36 ET  |  41 calls logged</w:t>
+        <w:t>Generated 2026-05-06 12:36 ET  |  43 calls logged</w:t>
       </w:r>
     </w:p>
     <w:p>
@@ -102,7 +102,7 @@
           </w:tcPr>
           <w:p>
             <w:r>
-              <w:t>15</w:t>
+              <w:t>16</w:t>
             </w:r>
           </w:p>
         </w:tc>
@@ -112,7 +112,7 @@
           </w:tcPr>
           <w:p>
             <w:r>
-              <w:t>8</w:t>
+              <w:t>9</w:t>
             </w:r>
           </w:p>
         </w:tc>
@@ -122,7 +122,7 @@
           </w:tcPr>
           <w:p>
             <w:r>
-              <w:t>53%</w:t>
+              <w:t>56%</w:t>
             </w:r>
           </w:p>
         </w:tc>
@@ -186,6 +186,16 @@
           </w:tcPr>
           <w:p>
             <w:r>
+              <w:t>7</w:t>
+            </w:r>
+          </w:p>
+        </w:tc>
+        <w:tc>
+          <w:tcPr>
+            <w:tcW w:type="dxa" w:w="2160"/>
+          </w:tcPr>
+          <w:p>
+            <w:r>
               <w:t>6</w:t>
             </w:r>
           </w:p>
@@ -196,17 +206,7 @@
           </w:tcPr>
           <w:p>
             <w:r>
-              <w:t>5</w:t>
-            </w:r>
-          </w:p>
-        </w:tc>
-        <w:tc>
-          <w:tcPr>
-            <w:tcW w:type="dxa" w:w="2160"/>
-          </w:tcPr>
-          <w:p>
-            <w:r>
-              <w:t>83%</w:t>
+              <w:t>86%</w:t>
             </w:r>
           </w:p>
         </w:tc>
@@ -407,6 +407,226 @@
       </w:pPr>
       <w:r>
         <w:t>Call Details</w:t>
+      </w:r>
+    </w:p>
+    <w:p>
+      <w:pPr>
+        <w:pStyle w:val="Heading2"/>
+      </w:pPr>
+      <w:r>
+        <w:rPr>
+          <w:color w:val="2E7D32"/>
+        </w:rPr>
+        <w:t>AMD — Advanced Micro Devices, Inc.  (WIN)</w:t>
+      </w:r>
+    </w:p>
+    <w:p>
+      <w:r>
+        <w:rPr>
+          <w:b/>
+        </w:rPr>
+        <w:t xml:space="preserve">Earnings date: </w:t>
+      </w:r>
+      <w:r>
+        <w:t xml:space="preserve">2026-05-05   </w:t>
+      </w:r>
+      <w:r>
+        <w:rPr>
+          <w:b/>
+        </w:rPr>
+        <w:t xml:space="preserve">Exit: </w:t>
+      </w:r>
+      <w:r>
+        <w:t xml:space="preserve">2026-05-06   </w:t>
+      </w:r>
+      <w:r>
+        <w:rPr>
+          <w:b/>
+        </w:rPr>
+        <w:t xml:space="preserve">Confidence: </w:t>
+      </w:r>
+      <w:r>
+        <w:t>100% (95-100%)</w:t>
+      </w:r>
+    </w:p>
+    <w:p>
+      <w:r>
+        <w:rPr>
+          <w:b/>
+        </w:rPr>
+        <w:t xml:space="preserve">Entry: </w:t>
+      </w:r>
+      <w:r>
+        <w:t xml:space="preserve">$294.91   </w:t>
+      </w:r>
+      <w:r>
+        <w:rPr>
+          <w:b/>
+        </w:rPr>
+        <w:t xml:space="preserve">Exit: </w:t>
+      </w:r>
+      <w:r>
+        <w:t xml:space="preserve">$415.60   </w:t>
+      </w:r>
+      <w:r>
+        <w:rPr>
+          <w:b/>
+        </w:rPr>
+        <w:t xml:space="preserve">P&amp;L: </w:t>
+      </w:r>
+      <w:r>
+        <w:t>$+603.45 (+40.9%)</w:t>
+      </w:r>
+    </w:p>
+    <w:p>
+      <w:r>
+        <w:rPr>
+          <w:b/>
+        </w:rPr>
+        <w:t xml:space="preserve">EPS: </w:t>
+      </w:r>
+      <w:r>
+        <w:t>$1.37 reported vs $1.29 est (+6.2%) — BEAT</w:t>
+      </w:r>
+    </w:p>
+    <w:p>
+      <w:r>
+        <w:rPr>
+          <w:b/>
+        </w:rPr>
+        <w:t xml:space="preserve">Call quality: </w:t>
+      </w:r>
+      <w:r>
+        <w:t>Algorithm aced the call ✓</w:t>
+      </w:r>
+    </w:p>
+    <w:p>
+      <w:r>
+        <w:rPr>
+          <w:b/>
+        </w:rPr>
+        <w:t xml:space="preserve">Analysis: </w:t>
+      </w:r>
+      <w:r>
+        <w:t>AMD beat EPS estimates by +6.2% (reported $1.37 vs $1.29 expected). The position returned +40.9% (WIN) against a 100% confidence call (95-100% tier). The model was well-calibrated — it correctly identified the earnings beat and the market confirmed it.</w:t>
+      </w:r>
+    </w:p>
+    <w:p>
+      <w:pPr>
+        <w:jc w:val="center"/>
+      </w:pPr>
+      <w:r>
+        <w:t>────────────────────────────────────────────────────────────</w:t>
+      </w:r>
+    </w:p>
+    <w:p>
+      <w:pPr>
+        <w:pStyle w:val="Heading2"/>
+      </w:pPr>
+      <w:r>
+        <w:rPr>
+          <w:color w:val="C62828"/>
+        </w:rPr>
+        <w:t>SHOP — Shopify Inc.  (LOSS)</w:t>
+      </w:r>
+    </w:p>
+    <w:p>
+      <w:r>
+        <w:rPr>
+          <w:b/>
+        </w:rPr>
+        <w:t xml:space="preserve">Earnings date: </w:t>
+      </w:r>
+      <w:r>
+        <w:t xml:space="preserve">2026-05-05   </w:t>
+      </w:r>
+      <w:r>
+        <w:rPr>
+          <w:b/>
+        </w:rPr>
+        <w:t xml:space="preserve">Exit: </w:t>
+      </w:r>
+      <w:r>
+        <w:t xml:space="preserve">2026-05-06   </w:t>
+      </w:r>
+      <w:r>
+        <w:rPr>
+          <w:b/>
+        </w:rPr>
+        <w:t xml:space="preserve">Confidence: </w:t>
+      </w:r>
+      <w:r>
+        <w:t>80% (70-84%)</w:t>
+      </w:r>
+    </w:p>
+    <w:p>
+      <w:r>
+        <w:rPr>
+          <w:b/>
+        </w:rPr>
+        <w:t xml:space="preserve">Entry: </w:t>
+      </w:r>
+      <w:r>
+        <w:t xml:space="preserve">$131.84   </w:t>
+      </w:r>
+      <w:r>
+        <w:rPr>
+          <w:b/>
+        </w:rPr>
+        <w:t xml:space="preserve">Exit: </w:t>
+      </w:r>
+      <w:r>
+        <w:t xml:space="preserve">$106.23   </w:t>
+      </w:r>
+      <w:r>
+        <w:rPr>
+          <w:b/>
+        </w:rPr>
+        <w:t xml:space="preserve">P&amp;L: </w:t>
+      </w:r>
+      <w:r>
+        <w:t>$-76.82 (-19.4%)</w:t>
+      </w:r>
+    </w:p>
+    <w:p>
+      <w:r>
+        <w:rPr>
+          <w:b/>
+        </w:rPr>
+        <w:t xml:space="preserve">EPS: </w:t>
+      </w:r>
+      <w:r>
+        <w:t>$-0.45 reported vs $0.24 est (-287.5%) — MISS</w:t>
+      </w:r>
+    </w:p>
+    <w:p>
+      <w:r>
+        <w:rPr>
+          <w:b/>
+        </w:rPr>
+        <w:t xml:space="preserve">Call quality: </w:t>
+      </w:r>
+      <w:r>
+        <w:t>Algorithm aced the call ✓</w:t>
+      </w:r>
+    </w:p>
+    <w:p>
+      <w:r>
+        <w:rPr>
+          <w:b/>
+        </w:rPr>
+        <w:t xml:space="preserve">Analysis: </w:t>
+      </w:r>
+      <w:r>
+        <w:t>SHOP missed EPS estimates by 287.5% (reported $-0.45 vs $0.24 expected). The position returned -19.4% (LOSS) against a 80% confidence call (70-84% tier). The model correctly anticipated downside risk; both the earnings miss and the market reaction aligned with the 70-84% tier prediction.</w:t>
+      </w:r>
+    </w:p>
+    <w:p>
+      <w:pPr>
+        <w:jc w:val="center"/>
+      </w:pPr>
+      <w:r>
+        <w:t>────────────────────────────────────────────────────────────</w:t>
       </w:r>
     </w:p>
     <w:p>

</xml_diff>